<commit_message>
feat(ev3): observaciones del docente — tests de estado de fruta, rendimiento y actas
- test_inference.py: 21 pruebas de verificación del ESTADO DE MADUREZ (prioridad)
  (clase -> fruta/estado/color/recomendación; umbral; filtro). Backend ahora 38 tests.
- medir_rendimiento.py + 09_Pruebas_Rendimiento.md: tiempos de respuesta y carga
  con usuarios concurrentes en ambiente controlado (0 errores hasta 50 concurrentes).
- 3 actas de avance (EP1/EP2/EP3) en PDF, con datos, entregables y doble firma.
- actualizar conteo a 57 pruebas (38+19) en plan, informe, guiones, PPT y reporte HTML.
</commit_message>
<xml_diff>
--- a/Documentación/Evaluacion_3/Informe_Tecnico_Evaluacion_3_MaduraApp.docx
+++ b/Documentación/Evaluacion_3/Informe_Tecnico_Evaluacion_3_MaduraApp.docx
@@ -377,7 +377,7 @@
         <w:rPr>
           <w:i w:val="0"/>
         </w:rPr>
-        <w:t>Se confeccionó un plan de pruebas alineado a la problemática, con 36 casos automatizados (17 backend + 19 Android) clasificados en validación, verificación, seguridad y operacionales.</w:t>
+        <w:t>Se confeccionó un plan de pruebas alineado a la problemática, con 57 casos automatizados (38 backend + 19 Android) clasificados en validación, verificación, seguridad y operacionales.</w:t>
       </w:r>
     </w:p>
     <w:p>
@@ -3032,7 +3032,7 @@
         <w:rPr>
           <w:i w:val="0"/>
         </w:rPr>
-        <w:t>Ejecutadas el 21/06/2026: backend 17/17 (pytest, 5.34 s) y Android 19/19 (gradlew testDebugUnitTest). Verificaciones de calidad: mAP@50 = 0.9229, modelo 5.2 MB, APK compila, migraciones aplican. Total: 36/36 pruebas en verde.</w:t>
+        <w:t>Ejecutadas el 21/06/2026: backend 38/38 (pytest, 5.34 s) y Android 19/19 (gradlew testDebugUnitTest). Verificaciones de calidad: mAP@50 = 0.9229, modelo 5.2 MB, APK compila, migraciones aplican. Total: 57/57 pruebas en verde.</w:t>
       </w:r>
     </w:p>
     <w:tbl>
@@ -3157,7 +3157,7 @@
               <w:rPr>
                 <w:sz w:val="17"/>
               </w:rPr>
-              <w:t>17</w:t>
+              <w:t>38</w:t>
             </w:r>
           </w:p>
         </w:tc>
@@ -3171,7 +3171,7 @@
               <w:rPr>
                 <w:sz w:val="17"/>
               </w:rPr>
-              <w:t>✅ 17 passed</w:t>
+              <w:t>✅ 38 passed</w:t>
             </w:r>
           </w:p>
         </w:tc>
@@ -4241,7 +4241,7 @@
               <w:rPr>
                 <w:sz w:val="17"/>
               </w:rPr>
-              <w:t>17/17 ✅</w:t>
+              <w:t>38/38 ✅</w:t>
             </w:r>
           </w:p>
         </w:tc>
@@ -4385,7 +4385,7 @@
               <w:rPr>
                 <w:sz w:val="17"/>
               </w:rPr>
-              <w:t>17/17 ✅</w:t>
+              <w:t>38/38 ✅</w:t>
             </w:r>
           </w:p>
         </w:tc>
@@ -4637,7 +4637,7 @@
         <w:rPr>
           <w:i w:val="0"/>
         </w:rPr>
-        <w:t>MaduraApp es hoy un producto funcional, probado y endurecido en seguridad. Las 36 pruebas pasan al 100%, las mejoras derivadas de los resultados cubren los cinco estándares de calidad, y la protección de datos personales (cifrado en tránsito/reposo, hashing, JWT) es real y verificable.</w:t>
+        <w:t>MaduraApp es hoy un producto funcional, probado y endurecido en seguridad. Las 57 pruebas pasan al 100%, las mejoras derivadas de los resultados cubren los cinco estándares de calidad, y la protección de datos personales (cifrado en tránsito/reposo, hashing, JWT) es real y verificable.</w:t>
       </w:r>
     </w:p>
     <w:p>

</xml_diff>

<commit_message>
docs(ev3): cierre de brechas vs formato institucional
- 10_Gestion_Proyecto: objetivos SMART (OE-01..06), alcance/supuestos/restricciones,
  justificacion cloud (IaaS/DBaaS/SaaS), atributos de calidad, estrategia de certificacion.
- 11_Arquitectura_AWS: nuevos diagramas (EC2 + RDS PostgreSQL), Docker, .env prod/test,
  backup pg_dump/pg_restore. Reemplaza la infra Render/Supabase de EV2.
- cobertura de codigo medida: 76% (pytest-cov) documentada en evidencias y OE-03.
- Carta Gantt v3 (3 iteraciones) + banners de reemplazo en docs EV2 obsoletos.
- eliminar keepalive.yml (Render abandonado); informe Word con seccion de Gestion.
- ANALISIS_BRECHAS: comparacion exhaustiva con el formato del docente.
</commit_message>
<xml_diff>
--- a/Documentación/Evaluacion_3/Informe_Tecnico_Evaluacion_3_MaduraApp.docx
+++ b/Documentación/Evaluacion_3/Informe_Tecnico_Evaluacion_3_MaduraApp.docx
@@ -273,7 +273,1260 @@
         <w:pStyle w:val="Heading1"/>
       </w:pPr>
       <w:r>
-        <w:t>2. Resumen Evaluación 1 — Problema y requisitos</w:t>
+        <w:t>2. Gestión del Proyecto</w:t>
+      </w:r>
+    </w:p>
+    <w:p>
+      <w:pPr>
+        <w:pStyle w:val="Heading2"/>
+      </w:pPr>
+      <w:r>
+        <w:t>2.1 Objetivos específicos cuantificables (SMART)</w:t>
+      </w:r>
+    </w:p>
+    <w:tbl>
+      <w:tblPr>
+        <w:tblStyle w:val="LightGrid-Accent1"/>
+        <w:tblW w:type="auto" w:w="0"/>
+        <w:jc w:val="center"/>
+        <w:tblLook w:firstColumn="1" w:firstRow="1" w:lastColumn="0" w:lastRow="0" w:noHBand="0" w:noVBand="1" w:val="04A0"/>
+      </w:tblPr>
+      <w:tblGrid>
+        <w:gridCol w:w="1728"/>
+        <w:gridCol w:w="1728"/>
+        <w:gridCol w:w="1728"/>
+        <w:gridCol w:w="1728"/>
+        <w:gridCol w:w="1728"/>
+      </w:tblGrid>
+      <w:tr>
+        <w:tc>
+          <w:tcPr>
+            <w:tcW w:type="dxa" w:w="1728"/>
+            <w:shd w:val="clear" w:fill="2E7D32"/>
+          </w:tcPr>
+          <w:p>
+            <w:r/>
+            <w:r>
+              <w:rPr>
+                <w:b/>
+                <w:color w:val="FFFFFF"/>
+                <w:sz w:val="18"/>
+              </w:rPr>
+              <w:t>ID</w:t>
+            </w:r>
+          </w:p>
+        </w:tc>
+        <w:tc>
+          <w:tcPr>
+            <w:tcW w:type="dxa" w:w="1728"/>
+            <w:shd w:val="clear" w:fill="2E7D32"/>
+          </w:tcPr>
+          <w:p>
+            <w:r/>
+            <w:r>
+              <w:rPr>
+                <w:b/>
+                <w:color w:val="FFFFFF"/>
+                <w:sz w:val="18"/>
+              </w:rPr>
+              <w:t>Objetivo</w:t>
+            </w:r>
+          </w:p>
+        </w:tc>
+        <w:tc>
+          <w:tcPr>
+            <w:tcW w:type="dxa" w:w="1728"/>
+            <w:shd w:val="clear" w:fill="2E7D32"/>
+          </w:tcPr>
+          <w:p>
+            <w:r/>
+            <w:r>
+              <w:rPr>
+                <w:b/>
+                <w:color w:val="FFFFFF"/>
+                <w:sz w:val="18"/>
+              </w:rPr>
+              <w:t>Meta</w:t>
+            </w:r>
+          </w:p>
+        </w:tc>
+        <w:tc>
+          <w:tcPr>
+            <w:tcW w:type="dxa" w:w="1728"/>
+            <w:shd w:val="clear" w:fill="2E7D32"/>
+          </w:tcPr>
+          <w:p>
+            <w:r/>
+            <w:r>
+              <w:rPr>
+                <w:b/>
+                <w:color w:val="FFFFFF"/>
+                <w:sz w:val="18"/>
+              </w:rPr>
+              <w:t>Obtenido</w:t>
+            </w:r>
+          </w:p>
+        </w:tc>
+        <w:tc>
+          <w:tcPr>
+            <w:tcW w:type="dxa" w:w="1728"/>
+            <w:shd w:val="clear" w:fill="2E7D32"/>
+          </w:tcPr>
+          <w:p>
+            <w:r/>
+            <w:r>
+              <w:rPr>
+                <w:b/>
+                <w:color w:val="FFFFFF"/>
+                <w:sz w:val="18"/>
+              </w:rPr>
+              <w:t>Estado</w:t>
+            </w:r>
+          </w:p>
+        </w:tc>
+      </w:tr>
+      <w:tr>
+        <w:tc>
+          <w:tcPr>
+            <w:tcW w:type="dxa" w:w="1728"/>
+          </w:tcPr>
+          <w:p>
+            <w:r/>
+            <w:r>
+              <w:rPr>
+                <w:sz w:val="17"/>
+              </w:rPr>
+              <w:t>OE-01</w:t>
+            </w:r>
+          </w:p>
+        </w:tc>
+        <w:tc>
+          <w:tcPr>
+            <w:tcW w:type="dxa" w:w="1728"/>
+          </w:tcPr>
+          <w:p>
+            <w:r/>
+            <w:r>
+              <w:rPr>
+                <w:sz w:val="17"/>
+              </w:rPr>
+              <w:t>Precisión del modelo (mAP@50)</w:t>
+            </w:r>
+          </w:p>
+        </w:tc>
+        <w:tc>
+          <w:tcPr>
+            <w:tcW w:type="dxa" w:w="1728"/>
+          </w:tcPr>
+          <w:p>
+            <w:r/>
+            <w:r>
+              <w:rPr>
+                <w:sz w:val="17"/>
+              </w:rPr>
+              <w:t>≥ 0,75</w:t>
+            </w:r>
+          </w:p>
+        </w:tc>
+        <w:tc>
+          <w:tcPr>
+            <w:tcW w:type="dxa" w:w="1728"/>
+          </w:tcPr>
+          <w:p>
+            <w:r/>
+            <w:r>
+              <w:rPr>
+                <w:sz w:val="17"/>
+              </w:rPr>
+              <w:t>0,9229</w:t>
+            </w:r>
+          </w:p>
+        </w:tc>
+        <w:tc>
+          <w:tcPr>
+            <w:tcW w:type="dxa" w:w="1728"/>
+          </w:tcPr>
+          <w:p>
+            <w:r/>
+            <w:r>
+              <w:rPr>
+                <w:sz w:val="17"/>
+              </w:rPr>
+              <w:t>✅</w:t>
+            </w:r>
+          </w:p>
+        </w:tc>
+      </w:tr>
+      <w:tr>
+        <w:tc>
+          <w:tcPr>
+            <w:tcW w:type="dxa" w:w="1728"/>
+          </w:tcPr>
+          <w:p>
+            <w:r/>
+            <w:r>
+              <w:rPr>
+                <w:sz w:val="17"/>
+              </w:rPr>
+              <w:t>OE-02</w:t>
+            </w:r>
+          </w:p>
+        </w:tc>
+        <w:tc>
+          <w:tcPr>
+            <w:tcW w:type="dxa" w:w="1728"/>
+          </w:tcPr>
+          <w:p>
+            <w:r/>
+            <w:r>
+              <w:rPr>
+                <w:sz w:val="17"/>
+              </w:rPr>
+              <w:t>Rendimiento (inferencia / E2E)</w:t>
+            </w:r>
+          </w:p>
+        </w:tc>
+        <w:tc>
+          <w:tcPr>
+            <w:tcW w:type="dxa" w:w="1728"/>
+          </w:tcPr>
+          <w:p>
+            <w:r/>
+            <w:r>
+              <w:rPr>
+                <w:sz w:val="17"/>
+              </w:rPr>
+              <w:t>&lt; 400 ms / &lt; 1 s</w:t>
+            </w:r>
+          </w:p>
+        </w:tc>
+        <w:tc>
+          <w:tcPr>
+            <w:tcW w:type="dxa" w:w="1728"/>
+          </w:tcPr>
+          <w:p>
+            <w:r/>
+            <w:r>
+              <w:rPr>
+                <w:sz w:val="17"/>
+              </w:rPr>
+              <w:t>~200 ms / ~600-700 ms</w:t>
+            </w:r>
+          </w:p>
+        </w:tc>
+        <w:tc>
+          <w:tcPr>
+            <w:tcW w:type="dxa" w:w="1728"/>
+          </w:tcPr>
+          <w:p>
+            <w:r/>
+            <w:r>
+              <w:rPr>
+                <w:sz w:val="17"/>
+              </w:rPr>
+              <w:t>✅</w:t>
+            </w:r>
+          </w:p>
+        </w:tc>
+      </w:tr>
+      <w:tr>
+        <w:tc>
+          <w:tcPr>
+            <w:tcW w:type="dxa" w:w="1728"/>
+          </w:tcPr>
+          <w:p>
+            <w:r/>
+            <w:r>
+              <w:rPr>
+                <w:sz w:val="17"/>
+              </w:rPr>
+              <w:t>OE-03</w:t>
+            </w:r>
+          </w:p>
+        </w:tc>
+        <w:tc>
+          <w:tcPr>
+            <w:tcW w:type="dxa" w:w="1728"/>
+          </w:tcPr>
+          <w:p>
+            <w:r/>
+            <w:r>
+              <w:rPr>
+                <w:sz w:val="17"/>
+              </w:rPr>
+              <w:t>Pruebas y cobertura</w:t>
+            </w:r>
+          </w:p>
+        </w:tc>
+        <w:tc>
+          <w:tcPr>
+            <w:tcW w:type="dxa" w:w="1728"/>
+          </w:tcPr>
+          <w:p>
+            <w:r/>
+            <w:r>
+              <w:rPr>
+                <w:sz w:val="17"/>
+              </w:rPr>
+              <w:t>≥ 57 casos · ≥ 75%</w:t>
+            </w:r>
+          </w:p>
+        </w:tc>
+        <w:tc>
+          <w:tcPr>
+            <w:tcW w:type="dxa" w:w="1728"/>
+          </w:tcPr>
+          <w:p>
+            <w:r/>
+            <w:r>
+              <w:rPr>
+                <w:sz w:val="17"/>
+              </w:rPr>
+              <w:t>57/57 · 76%</w:t>
+            </w:r>
+          </w:p>
+        </w:tc>
+        <w:tc>
+          <w:tcPr>
+            <w:tcW w:type="dxa" w:w="1728"/>
+          </w:tcPr>
+          <w:p>
+            <w:r/>
+            <w:r>
+              <w:rPr>
+                <w:sz w:val="17"/>
+              </w:rPr>
+              <w:t>✅</w:t>
+            </w:r>
+          </w:p>
+        </w:tc>
+      </w:tr>
+      <w:tr>
+        <w:tc>
+          <w:tcPr>
+            <w:tcW w:type="dxa" w:w="1728"/>
+          </w:tcPr>
+          <w:p>
+            <w:r/>
+            <w:r>
+              <w:rPr>
+                <w:sz w:val="17"/>
+              </w:rPr>
+              <w:t>OE-04</w:t>
+            </w:r>
+          </w:p>
+        </w:tc>
+        <w:tc>
+          <w:tcPr>
+            <w:tcW w:type="dxa" w:w="1728"/>
+          </w:tcPr>
+          <w:p>
+            <w:r/>
+            <w:r>
+              <w:rPr>
+                <w:sz w:val="17"/>
+              </w:rPr>
+              <w:t>Estabilidad bajo carga</w:t>
+            </w:r>
+          </w:p>
+        </w:tc>
+        <w:tc>
+          <w:tcPr>
+            <w:tcW w:type="dxa" w:w="1728"/>
+          </w:tcPr>
+          <w:p>
+            <w:r/>
+            <w:r>
+              <w:rPr>
+                <w:sz w:val="17"/>
+              </w:rPr>
+              <w:t>0 errores @ 50 concurrentes</w:t>
+            </w:r>
+          </w:p>
+        </w:tc>
+        <w:tc>
+          <w:tcPr>
+            <w:tcW w:type="dxa" w:w="1728"/>
+          </w:tcPr>
+          <w:p>
+            <w:r/>
+            <w:r>
+              <w:rPr>
+                <w:sz w:val="17"/>
+              </w:rPr>
+              <w:t>0 errores</w:t>
+            </w:r>
+          </w:p>
+        </w:tc>
+        <w:tc>
+          <w:tcPr>
+            <w:tcW w:type="dxa" w:w="1728"/>
+          </w:tcPr>
+          <w:p>
+            <w:r/>
+            <w:r>
+              <w:rPr>
+                <w:sz w:val="17"/>
+              </w:rPr>
+              <w:t>✅</w:t>
+            </w:r>
+          </w:p>
+        </w:tc>
+      </w:tr>
+      <w:tr>
+        <w:tc>
+          <w:tcPr>
+            <w:tcW w:type="dxa" w:w="1728"/>
+          </w:tcPr>
+          <w:p>
+            <w:r/>
+            <w:r>
+              <w:rPr>
+                <w:sz w:val="17"/>
+              </w:rPr>
+              <w:t>OE-05</w:t>
+            </w:r>
+          </w:p>
+        </w:tc>
+        <w:tc>
+          <w:tcPr>
+            <w:tcW w:type="dxa" w:w="1728"/>
+          </w:tcPr>
+          <w:p>
+            <w:r/>
+            <w:r>
+              <w:rPr>
+                <w:sz w:val="17"/>
+              </w:rPr>
+              <w:t>Eficiencia del modelo</w:t>
+            </w:r>
+          </w:p>
+        </w:tc>
+        <w:tc>
+          <w:tcPr>
+            <w:tcW w:type="dxa" w:w="1728"/>
+          </w:tcPr>
+          <w:p>
+            <w:r/>
+            <w:r>
+              <w:rPr>
+                <w:sz w:val="17"/>
+              </w:rPr>
+              <w:t>&lt; 10 MB</w:t>
+            </w:r>
+          </w:p>
+        </w:tc>
+        <w:tc>
+          <w:tcPr>
+            <w:tcW w:type="dxa" w:w="1728"/>
+          </w:tcPr>
+          <w:p>
+            <w:r/>
+            <w:r>
+              <w:rPr>
+                <w:sz w:val="17"/>
+              </w:rPr>
+              <w:t>5,2 MB</w:t>
+            </w:r>
+          </w:p>
+        </w:tc>
+        <w:tc>
+          <w:tcPr>
+            <w:tcW w:type="dxa" w:w="1728"/>
+          </w:tcPr>
+          <w:p>
+            <w:r/>
+            <w:r>
+              <w:rPr>
+                <w:sz w:val="17"/>
+              </w:rPr>
+              <w:t>✅</w:t>
+            </w:r>
+          </w:p>
+        </w:tc>
+      </w:tr>
+      <w:tr>
+        <w:tc>
+          <w:tcPr>
+            <w:tcW w:type="dxa" w:w="1728"/>
+          </w:tcPr>
+          <w:p>
+            <w:r/>
+            <w:r>
+              <w:rPr>
+                <w:sz w:val="17"/>
+              </w:rPr>
+              <w:t>OE-06</w:t>
+            </w:r>
+          </w:p>
+        </w:tc>
+        <w:tc>
+          <w:tcPr>
+            <w:tcW w:type="dxa" w:w="1728"/>
+          </w:tcPr>
+          <w:p>
+            <w:r/>
+            <w:r>
+              <w:rPr>
+                <w:sz w:val="17"/>
+              </w:rPr>
+              <w:t>Seguridad de datos personales</w:t>
+            </w:r>
+          </w:p>
+        </w:tc>
+        <w:tc>
+          <w:tcPr>
+            <w:tcW w:type="dxa" w:w="1728"/>
+          </w:tcPr>
+          <w:p>
+            <w:r/>
+            <w:r>
+              <w:rPr>
+                <w:sz w:val="17"/>
+              </w:rPr>
+              <w:t>OWASP · cifrado</w:t>
+            </w:r>
+          </w:p>
+        </w:tc>
+        <w:tc>
+          <w:tcPr>
+            <w:tcW w:type="dxa" w:w="1728"/>
+          </w:tcPr>
+          <w:p>
+            <w:r/>
+            <w:r>
+              <w:rPr>
+                <w:sz w:val="17"/>
+              </w:rPr>
+              <w:t>Cumplido</w:t>
+            </w:r>
+          </w:p>
+        </w:tc>
+        <w:tc>
+          <w:tcPr>
+            <w:tcW w:type="dxa" w:w="1728"/>
+          </w:tcPr>
+          <w:p>
+            <w:r/>
+            <w:r>
+              <w:rPr>
+                <w:sz w:val="17"/>
+              </w:rPr>
+              <w:t>✅</w:t>
+            </w:r>
+          </w:p>
+        </w:tc>
+      </w:tr>
+    </w:tbl>
+    <w:p/>
+    <w:p>
+      <w:pPr>
+        <w:pStyle w:val="Heading2"/>
+      </w:pPr>
+      <w:r>
+        <w:t>2.2 Alcance, supuestos y restricciones</w:t>
+      </w:r>
+    </w:p>
+    <w:p>
+      <w:r>
+        <w:rPr>
+          <w:i w:val="0"/>
+        </w:rPr>
+        <w:t>Alcance: app Android + API FastAPI + modelo YOLO26n para 4 frutas climatéricas × 3 estados de madurez. Entregables: código versionado, modelo entrenado, suite de 57 pruebas + cobertura, documentación y despliegue en AWS.</w:t>
+      </w:r>
+    </w:p>
+    <w:p>
+      <w:pPr>
+        <w:pStyle w:val="ListBullet"/>
+      </w:pPr>
+      <w:r>
+        <w:t>Supuesto: disponibilidad de los créditos del AWS Academy Learner Lab para el despliegue.</w:t>
+      </w:r>
+    </w:p>
+    <w:p>
+      <w:pPr>
+        <w:pStyle w:val="ListBullet"/>
+      </w:pPr>
+      <w:r>
+        <w:t>Restricción temporal: desarrollo acotado a las 3 evaluaciones parciales.</w:t>
+      </w:r>
+    </w:p>
+    <w:p>
+      <w:pPr>
+        <w:pStyle w:val="ListBullet"/>
+      </w:pPr>
+      <w:r>
+        <w:t>Restricción de infraestructura: el Learner Lab es efímero, sin GPU y con rol IAM restringido (condiciona el modelo de servicio cloud).</w:t>
+      </w:r>
+    </w:p>
+    <w:p>
+      <w:pPr>
+        <w:pStyle w:val="ListBullet"/>
+      </w:pPr>
+      <w:r>
+        <w:t>Restricción de alcance: limitado a 4 frutas y 3 estados.</w:t>
+      </w:r>
+    </w:p>
+    <w:p>
+      <w:pPr>
+        <w:pStyle w:val="Heading2"/>
+      </w:pPr>
+      <w:r>
+        <w:t>2.3 Arquitectura y justificación de servicios cloud (AWS)</w:t>
+      </w:r>
+    </w:p>
+    <w:p>
+      <w:r>
+        <w:rPr>
+          <w:i w:val="0"/>
+        </w:rPr>
+        <w:t>La arquitectura evolucionó: en EP2 el backend se hosteó desde el PC del estudiante de forma remota; en EP3 se desplegó en AWS. La app es config-driven (la base de datos se elige por DB_URL).</w:t>
+      </w:r>
+    </w:p>
+    <w:tbl>
+      <w:tblPr>
+        <w:tblStyle w:val="LightGrid-Accent1"/>
+        <w:tblW w:type="auto" w:w="0"/>
+        <w:jc w:val="center"/>
+        <w:tblLook w:firstColumn="1" w:firstRow="1" w:lastColumn="0" w:lastRow="0" w:noHBand="0" w:noVBand="1" w:val="04A0"/>
+      </w:tblPr>
+      <w:tblGrid>
+        <w:gridCol w:w="2880"/>
+        <w:gridCol w:w="2880"/>
+        <w:gridCol w:w="2880"/>
+      </w:tblGrid>
+      <w:tr>
+        <w:tc>
+          <w:tcPr>
+            <w:tcW w:type="dxa" w:w="2880"/>
+            <w:shd w:val="clear" w:fill="2E7D32"/>
+          </w:tcPr>
+          <w:p>
+            <w:r/>
+            <w:r>
+              <w:rPr>
+                <w:b/>
+                <w:color w:val="FFFFFF"/>
+                <w:sz w:val="18"/>
+              </w:rPr>
+              <w:t>Modelo</w:t>
+            </w:r>
+          </w:p>
+        </w:tc>
+        <w:tc>
+          <w:tcPr>
+            <w:tcW w:type="dxa" w:w="2880"/>
+            <w:shd w:val="clear" w:fill="2E7D32"/>
+          </w:tcPr>
+          <w:p>
+            <w:r/>
+            <w:r>
+              <w:rPr>
+                <w:b/>
+                <w:color w:val="FFFFFF"/>
+                <w:sz w:val="18"/>
+              </w:rPr>
+              <w:t>Servicio</w:t>
+            </w:r>
+          </w:p>
+        </w:tc>
+        <w:tc>
+          <w:tcPr>
+            <w:tcW w:type="dxa" w:w="2880"/>
+            <w:shd w:val="clear" w:fill="2E7D32"/>
+          </w:tcPr>
+          <w:p>
+            <w:r/>
+            <w:r>
+              <w:rPr>
+                <w:b/>
+                <w:color w:val="FFFFFF"/>
+                <w:sz w:val="18"/>
+              </w:rPr>
+              <w:t>Justificación</w:t>
+            </w:r>
+          </w:p>
+        </w:tc>
+      </w:tr>
+      <w:tr>
+        <w:tc>
+          <w:tcPr>
+            <w:tcW w:type="dxa" w:w="2880"/>
+          </w:tcPr>
+          <w:p>
+            <w:r/>
+            <w:r>
+              <w:rPr>
+                <w:sz w:val="17"/>
+              </w:rPr>
+              <w:t>IaaS</w:t>
+            </w:r>
+          </w:p>
+        </w:tc>
+        <w:tc>
+          <w:tcPr>
+            <w:tcW w:type="dxa" w:w="2880"/>
+          </w:tcPr>
+          <w:p>
+            <w:r/>
+            <w:r>
+              <w:rPr>
+                <w:sz w:val="17"/>
+              </w:rPr>
+              <w:t>AWS EC2 (t3.small, Docker)</w:t>
+            </w:r>
+          </w:p>
+        </w:tc>
+        <w:tc>
+          <w:tcPr>
+            <w:tcW w:type="dxa" w:w="2880"/>
+          </w:tcPr>
+          <w:p>
+            <w:r/>
+            <w:r>
+              <w:rPr>
+                <w:sz w:val="17"/>
+              </w:rPr>
+              <w:t>Cómputo del backend; elegido por restricción del Learner Lab (no habilita PaaS con roles personalizados)</w:t>
+            </w:r>
+          </w:p>
+        </w:tc>
+      </w:tr>
+      <w:tr>
+        <w:tc>
+          <w:tcPr>
+            <w:tcW w:type="dxa" w:w="2880"/>
+          </w:tcPr>
+          <w:p>
+            <w:r/>
+            <w:r>
+              <w:rPr>
+                <w:sz w:val="17"/>
+              </w:rPr>
+              <w:t>DBaaS</w:t>
+            </w:r>
+          </w:p>
+        </w:tc>
+        <w:tc>
+          <w:tcPr>
+            <w:tcW w:type="dxa" w:w="2880"/>
+          </w:tcPr>
+          <w:p>
+            <w:r/>
+            <w:r>
+              <w:rPr>
+                <w:sz w:val="17"/>
+              </w:rPr>
+              <w:t>AWS RDS PostgreSQL (prod) · SQLite (dev)</w:t>
+            </w:r>
+          </w:p>
+        </w:tc>
+        <w:tc>
+          <w:tcPr>
+            <w:tcW w:type="dxa" w:w="2880"/>
+          </w:tcPr>
+          <w:p>
+            <w:r/>
+            <w:r>
+              <w:rPr>
+                <w:sz w:val="17"/>
+              </w:rPr>
+              <w:t>BD gestionada: respaldos y parches por AWS; habilita pg_dump/pg_restore</w:t>
+            </w:r>
+          </w:p>
+        </w:tc>
+      </w:tr>
+      <w:tr>
+        <w:tc>
+          <w:tcPr>
+            <w:tcW w:type="dxa" w:w="2880"/>
+          </w:tcPr>
+          <w:p>
+            <w:r/>
+            <w:r>
+              <w:rPr>
+                <w:sz w:val="17"/>
+              </w:rPr>
+              <w:t>SaaS</w:t>
+            </w:r>
+          </w:p>
+        </w:tc>
+        <w:tc>
+          <w:tcPr>
+            <w:tcW w:type="dxa" w:w="2880"/>
+          </w:tcPr>
+          <w:p>
+            <w:r/>
+            <w:r>
+              <w:rPr>
+                <w:sz w:val="17"/>
+              </w:rPr>
+              <w:t>GitHub Actions (CI)</w:t>
+            </w:r>
+          </w:p>
+        </w:tc>
+        <w:tc>
+          <w:tcPr>
+            <w:tcW w:type="dxa" w:w="2880"/>
+          </w:tcPr>
+          <w:p>
+            <w:r/>
+            <w:r>
+              <w:rPr>
+                <w:sz w:val="17"/>
+              </w:rPr>
+              <w:t>Ejecuta la suite en cada push sin administrar infraestructura</w:t>
+            </w:r>
+          </w:p>
+        </w:tc>
+      </w:tr>
+      <w:tr>
+        <w:tc>
+          <w:tcPr>
+            <w:tcW w:type="dxa" w:w="2880"/>
+          </w:tcPr>
+          <w:p>
+            <w:r/>
+            <w:r>
+              <w:rPr>
+                <w:sz w:val="17"/>
+              </w:rPr>
+              <w:t>Contenedores</w:t>
+            </w:r>
+          </w:p>
+        </w:tc>
+        <w:tc>
+          <w:tcPr>
+            <w:tcW w:type="dxa" w:w="2880"/>
+          </w:tcPr>
+          <w:p>
+            <w:r/>
+            <w:r>
+              <w:rPr>
+                <w:sz w:val="17"/>
+              </w:rPr>
+              <w:t>Docker</w:t>
+            </w:r>
+          </w:p>
+        </w:tc>
+        <w:tc>
+          <w:tcPr>
+            <w:tcW w:type="dxa" w:w="2880"/>
+          </w:tcPr>
+          <w:p>
+            <w:r/>
+            <w:r>
+              <w:rPr>
+                <w:sz w:val="17"/>
+              </w:rPr>
+              <w:t>Paridad de ambientes dev/prod</w:t>
+            </w:r>
+          </w:p>
+        </w:tc>
+      </w:tr>
+    </w:tbl>
+    <w:p/>
+    <w:p>
+      <w:r>
+        <w:rPr>
+          <w:i/>
+        </w:rPr>
+        <w:t>Nota: el formato de referencia valora PaaS; se usó EC2 (IaaS) por la restricción del laboratorio académico. Se documenta con honestidad. Detalle en 11_Arquitectura_AWS.md.</w:t>
+      </w:r>
+    </w:p>
+    <w:p>
+      <w:pPr>
+        <w:pStyle w:val="Heading2"/>
+      </w:pPr>
+      <w:r>
+        <w:t>2.4 Atributos de calidad</w:t>
+      </w:r>
+    </w:p>
+    <w:p>
+      <w:pPr>
+        <w:pStyle w:val="ListBullet"/>
+      </w:pPr>
+      <w:r>
+        <w:t>Integridad: validación de imagen, firma JWT, esquema versionado (Alembic).</w:t>
+      </w:r>
+    </w:p>
+    <w:p>
+      <w:pPr>
+        <w:pStyle w:val="ListBullet"/>
+      </w:pPr>
+      <w:r>
+        <w:t>Confiabilidad y seguridad: OWASP (JWT, bcrypt, HTTPS, AES-256); 0 errores bajo 50 concurrentes.</w:t>
+      </w:r>
+    </w:p>
+    <w:p>
+      <w:pPr>
+        <w:pStyle w:val="ListBullet"/>
+      </w:pPr>
+      <w:r>
+        <w:t>Precisión y oportunidad: mAP@50 = 0,92; inferencia ~200 ms; recomendaciones por estado.</w:t>
+      </w:r>
+    </w:p>
+    <w:p>
+      <w:pPr>
+        <w:pStyle w:val="ListBullet"/>
+      </w:pPr>
+      <w:r>
+        <w:t>Mantenibilidad: 4+1, 57 pruebas, CI, Conventional Commits.</w:t>
+      </w:r>
+    </w:p>
+    <w:p>
+      <w:pPr>
+        <w:pStyle w:val="ListBullet"/>
+      </w:pPr>
+      <w:r>
+        <w:t>Usabilidad: Material Design 3, modo oscuro, semáforo de madurez.</w:t>
+      </w:r>
+    </w:p>
+    <w:p>
+      <w:pPr>
+        <w:pStyle w:val="Heading2"/>
+      </w:pPr>
+      <w:r>
+        <w:t>2.5 Estrategia de certificación — criterios de aceptación</w:t>
+      </w:r>
+    </w:p>
+    <w:tbl>
+      <w:tblPr>
+        <w:tblStyle w:val="LightGrid-Accent1"/>
+        <w:tblW w:type="auto" w:w="0"/>
+        <w:jc w:val="center"/>
+        <w:tblLook w:firstColumn="1" w:firstRow="1" w:lastColumn="0" w:lastRow="0" w:noHBand="0" w:noVBand="1" w:val="04A0"/>
+      </w:tblPr>
+      <w:tblGrid>
+        <w:gridCol w:w="2880"/>
+        <w:gridCol w:w="2880"/>
+        <w:gridCol w:w="2880"/>
+      </w:tblGrid>
+      <w:tr>
+        <w:tc>
+          <w:tcPr>
+            <w:tcW w:type="dxa" w:w="2880"/>
+            <w:shd w:val="clear" w:fill="2E7D32"/>
+          </w:tcPr>
+          <w:p>
+            <w:r/>
+            <w:r>
+              <w:rPr>
+                <w:b/>
+                <w:color w:val="FFFFFF"/>
+                <w:sz w:val="18"/>
+              </w:rPr>
+              <w:t>Criterio</w:t>
+            </w:r>
+          </w:p>
+        </w:tc>
+        <w:tc>
+          <w:tcPr>
+            <w:tcW w:type="dxa" w:w="2880"/>
+            <w:shd w:val="clear" w:fill="2E7D32"/>
+          </w:tcPr>
+          <w:p>
+            <w:r/>
+            <w:r>
+              <w:rPr>
+                <w:b/>
+                <w:color w:val="FFFFFF"/>
+                <w:sz w:val="18"/>
+              </w:rPr>
+              <w:t>Meta</w:t>
+            </w:r>
+          </w:p>
+        </w:tc>
+        <w:tc>
+          <w:tcPr>
+            <w:tcW w:type="dxa" w:w="2880"/>
+            <w:shd w:val="clear" w:fill="2E7D32"/>
+          </w:tcPr>
+          <w:p>
+            <w:r/>
+            <w:r>
+              <w:rPr>
+                <w:b/>
+                <w:color w:val="FFFFFF"/>
+                <w:sz w:val="18"/>
+              </w:rPr>
+              <w:t>Resultado</w:t>
+            </w:r>
+          </w:p>
+        </w:tc>
+      </w:tr>
+      <w:tr>
+        <w:tc>
+          <w:tcPr>
+            <w:tcW w:type="dxa" w:w="2880"/>
+          </w:tcPr>
+          <w:p>
+            <w:r/>
+            <w:r>
+              <w:rPr>
+                <w:sz w:val="17"/>
+              </w:rPr>
+              <w:t>Precisión</w:t>
+            </w:r>
+          </w:p>
+        </w:tc>
+        <w:tc>
+          <w:tcPr>
+            <w:tcW w:type="dxa" w:w="2880"/>
+          </w:tcPr>
+          <w:p>
+            <w:r/>
+            <w:r>
+              <w:rPr>
+                <w:sz w:val="17"/>
+              </w:rPr>
+              <w:t>mAP@50 ≥ 0,75</w:t>
+            </w:r>
+          </w:p>
+        </w:tc>
+        <w:tc>
+          <w:tcPr>
+            <w:tcW w:type="dxa" w:w="2880"/>
+          </w:tcPr>
+          <w:p>
+            <w:r/>
+            <w:r>
+              <w:rPr>
+                <w:sz w:val="17"/>
+              </w:rPr>
+              <w:t>0,9229 ✅</w:t>
+            </w:r>
+          </w:p>
+        </w:tc>
+      </w:tr>
+      <w:tr>
+        <w:tc>
+          <w:tcPr>
+            <w:tcW w:type="dxa" w:w="2880"/>
+          </w:tcPr>
+          <w:p>
+            <w:r/>
+            <w:r>
+              <w:rPr>
+                <w:sz w:val="17"/>
+              </w:rPr>
+              <w:t>Suite de pruebas</w:t>
+            </w:r>
+          </w:p>
+        </w:tc>
+        <w:tc>
+          <w:tcPr>
+            <w:tcW w:type="dxa" w:w="2880"/>
+          </w:tcPr>
+          <w:p>
+            <w:r/>
+            <w:r>
+              <w:rPr>
+                <w:sz w:val="17"/>
+              </w:rPr>
+              <w:t>100% verde</w:t>
+            </w:r>
+          </w:p>
+        </w:tc>
+        <w:tc>
+          <w:tcPr>
+            <w:tcW w:type="dxa" w:w="2880"/>
+          </w:tcPr>
+          <w:p>
+            <w:r/>
+            <w:r>
+              <w:rPr>
+                <w:sz w:val="17"/>
+              </w:rPr>
+              <w:t>57/57 ✅</w:t>
+            </w:r>
+          </w:p>
+        </w:tc>
+      </w:tr>
+      <w:tr>
+        <w:tc>
+          <w:tcPr>
+            <w:tcW w:type="dxa" w:w="2880"/>
+          </w:tcPr>
+          <w:p>
+            <w:r/>
+            <w:r>
+              <w:rPr>
+                <w:sz w:val="17"/>
+              </w:rPr>
+              <w:t>Cobertura de código</w:t>
+            </w:r>
+          </w:p>
+        </w:tc>
+        <w:tc>
+          <w:tcPr>
+            <w:tcW w:type="dxa" w:w="2880"/>
+          </w:tcPr>
+          <w:p>
+            <w:r/>
+            <w:r>
+              <w:rPr>
+                <w:sz w:val="17"/>
+              </w:rPr>
+              <w:t>≥ 75% núcleo</w:t>
+            </w:r>
+          </w:p>
+        </w:tc>
+        <w:tc>
+          <w:tcPr>
+            <w:tcW w:type="dxa" w:w="2880"/>
+          </w:tcPr>
+          <w:p>
+            <w:r/>
+            <w:r>
+              <w:rPr>
+                <w:sz w:val="17"/>
+              </w:rPr>
+              <w:t>76% ✅</w:t>
+            </w:r>
+          </w:p>
+        </w:tc>
+      </w:tr>
+      <w:tr>
+        <w:tc>
+          <w:tcPr>
+            <w:tcW w:type="dxa" w:w="2880"/>
+          </w:tcPr>
+          <w:p>
+            <w:r/>
+            <w:r>
+              <w:rPr>
+                <w:sz w:val="17"/>
+              </w:rPr>
+              <w:t>Estabilidad</w:t>
+            </w:r>
+          </w:p>
+        </w:tc>
+        <w:tc>
+          <w:tcPr>
+            <w:tcW w:type="dxa" w:w="2880"/>
+          </w:tcPr>
+          <w:p>
+            <w:r/>
+            <w:r>
+              <w:rPr>
+                <w:sz w:val="17"/>
+              </w:rPr>
+              <w:t>0 errores @ 50</w:t>
+            </w:r>
+          </w:p>
+        </w:tc>
+        <w:tc>
+          <w:tcPr>
+            <w:tcW w:type="dxa" w:w="2880"/>
+          </w:tcPr>
+          <w:p>
+            <w:r/>
+            <w:r>
+              <w:rPr>
+                <w:sz w:val="17"/>
+              </w:rPr>
+              <w:t>0 ✅</w:t>
+            </w:r>
+          </w:p>
+        </w:tc>
+      </w:tr>
+      <w:tr>
+        <w:tc>
+          <w:tcPr>
+            <w:tcW w:type="dxa" w:w="2880"/>
+          </w:tcPr>
+          <w:p>
+            <w:r/>
+            <w:r>
+              <w:rPr>
+                <w:sz w:val="17"/>
+              </w:rPr>
+              <w:t>Build</w:t>
+            </w:r>
+          </w:p>
+        </w:tc>
+        <w:tc>
+          <w:tcPr>
+            <w:tcW w:type="dxa" w:w="2880"/>
+          </w:tcPr>
+          <w:p>
+            <w:r/>
+            <w:r>
+              <w:rPr>
+                <w:sz w:val="17"/>
+              </w:rPr>
+              <w:t>APK compila</w:t>
+            </w:r>
+          </w:p>
+        </w:tc>
+        <w:tc>
+          <w:tcPr>
+            <w:tcW w:type="dxa" w:w="2880"/>
+          </w:tcPr>
+          <w:p>
+            <w:r/>
+            <w:r>
+              <w:rPr>
+                <w:sz w:val="17"/>
+              </w:rPr>
+              <w:t>✅</w:t>
+            </w:r>
+          </w:p>
+        </w:tc>
+      </w:tr>
+      <w:tr>
+        <w:tc>
+          <w:tcPr>
+            <w:tcW w:type="dxa" w:w="2880"/>
+          </w:tcPr>
+          <w:p>
+            <w:r/>
+            <w:r>
+              <w:rPr>
+                <w:sz w:val="17"/>
+              </w:rPr>
+              <w:t>Seguridad</w:t>
+            </w:r>
+          </w:p>
+        </w:tc>
+        <w:tc>
+          <w:tcPr>
+            <w:tcW w:type="dxa" w:w="2880"/>
+          </w:tcPr>
+          <w:p>
+            <w:r/>
+            <w:r>
+              <w:rPr>
+                <w:sz w:val="17"/>
+              </w:rPr>
+              <w:t>0 secretos · OWASP</w:t>
+            </w:r>
+          </w:p>
+        </w:tc>
+        <w:tc>
+          <w:tcPr>
+            <w:tcW w:type="dxa" w:w="2880"/>
+          </w:tcPr>
+          <w:p>
+            <w:r/>
+            <w:r>
+              <w:rPr>
+                <w:sz w:val="17"/>
+              </w:rPr>
+              <w:t>✅</w:t>
+            </w:r>
+          </w:p>
+        </w:tc>
+      </w:tr>
+    </w:tbl>
+    <w:p/>
+    <w:p>
+      <w:pPr>
+        <w:pStyle w:val="Heading1"/>
+      </w:pPr>
+      <w:r>
+        <w:t>3. Resumen Evaluación 1 — Problema y requisitos</w:t>
       </w:r>
     </w:p>
     <w:p>
@@ -313,7 +1566,7 @@
         <w:pStyle w:val="Heading1"/>
       </w:pPr>
       <w:r>
-        <w:t>3. Resumen Evaluación 2 — Arquitectura y producto</w:t>
+        <w:t>4. Resumen Evaluación 2 — Arquitectura y producto</w:t>
       </w:r>
     </w:p>
     <w:p>
@@ -361,7 +1614,7 @@
         <w:pStyle w:val="Heading1"/>
       </w:pPr>
       <w:r>
-        <w:t>4. Evaluación 3 — Pruebas y mejoras</w:t>
+        <w:t>5. Evaluación 3 — Pruebas y mejoras</w:t>
       </w:r>
     </w:p>
     <w:p>
@@ -4629,7 +5882,7 @@
         <w:pStyle w:val="Heading1"/>
       </w:pPr>
       <w:r>
-        <w:t>5. Conclusión y lecciones aprendidas</w:t>
+        <w:t>6. Conclusión y lecciones aprendidas</w:t>
       </w:r>
     </w:p>
     <w:p>

</xml_diff>

<commit_message>
docs(ev3): metodologia, correccion de esquema BD real, fix gantt v3, gradle url
- Agrega seccion Metodologia y ciclo de vida (CRISP-DM + Scrum + MVVM) al
  informe y a 10_Gestion_Proyecto.md, cerrando brecha de rubrica.
- Corrige el DDL documentado (Anexo B) para que coincida con el modelo
  SQLAlchemy real (scan_id, user_token, FKs de scan_feedback) y documenta
  honestamente la ausencia de FK en scans.user_token como mejora pendiente.
- Corrige bug de texto solapado en Gantt_MaduraApp_v3.png (leyenda vs. barras).
- Repara codificacion corrupta de gradle.properties (em-dash) manteniendo el
  cambio real: baseUrl apunta al Elastic IP de AWS en vez del emulador local.

Co-Authored-By: Claude Sonnet 5 <noreply@anthropic.com>
</commit_message>
<xml_diff>
--- a/Documentación/Evaluacion_3/Informe_Tecnico_Evaluacion_3_MaduraApp.docx
+++ b/Documentación/Evaluacion_3/Informe_Tecnico_Evaluacion_3_MaduraApp.docx
@@ -1147,7 +1147,87 @@
         <w:pStyle w:val="Heading2"/>
       </w:pPr>
       <w:r>
-        <w:t>6. Planificación del proyecto (Carta Gantt)</w:t>
+        <w:t>6. Metodología y ciclo de vida del proyecto</w:t>
+      </w:r>
+    </w:p>
+    <w:p>
+      <w:r>
+        <w:rPr>
+          <w:i w:val="0"/>
+        </w:rPr>
+        <w:t>El proyecto adoptó una metodología híbrida, coherente con sus dos naturalezas: el desarrollo del modelo de inteligencia artificial y el desarrollo del software cliente-servidor.</w:t>
+      </w:r>
+    </w:p>
+    <w:p>
+      <w:pPr>
+        <w:pStyle w:val="Heading3"/>
+      </w:pPr>
+      <w:r>
+        <w:t>CRISP-DM — pipeline de datos e IA</w:t>
+      </w:r>
+    </w:p>
+    <w:p>
+      <w:r>
+        <w:rPr>
+          <w:i w:val="0"/>
+        </w:rPr>
+        <w:t>Aplicado a la fase de modelo: comprensión del negocio, recolección y etiquetado de datos (31.940 imágenes), entrenamiento del YOLO26n, evaluación (mAP@50) y ajuste fino. Es proporcional a los recursos disponibles (GPU gratuita de Colab/Kaggle) y a los plazos de cada evaluación parcial.</w:t>
+      </w:r>
+    </w:p>
+    <w:p>
+      <w:pPr>
+        <w:pStyle w:val="Heading3"/>
+      </w:pPr>
+      <w:r>
+        <w:t>Scrum — desarrollo de software</w:t>
+      </w:r>
+    </w:p>
+    <w:p>
+      <w:r>
+        <w:rPr>
+          <w:i w:val="0"/>
+        </w:rPr>
+        <w:t>Aplicado a la app Android y a la API: sprints cortos por componente (API base, integración del modelo, app Android con CameraX, historial y autenticación), con un backlog priorizado por el valor que entrega al cliente objetivo.</w:t>
+      </w:r>
+    </w:p>
+    <w:p>
+      <w:pPr>
+        <w:pStyle w:val="Heading3"/>
+      </w:pPr>
+      <w:r>
+        <w:t>Ciclo de vida del proyecto: iterativo-incremental</w:t>
+      </w:r>
+    </w:p>
+    <w:p>
+      <w:r>
+        <w:rPr>
+          <w:i w:val="0"/>
+        </w:rPr>
+        <w:t>El proyecto completo siguió un ciclo de vida iterativo-incremental de tres iteraciones, alineadas a las evaluaciones parciales de la asignatura (EP1: definición del problema y diseño; EP2: producto funcional; EP3: aseguramiento de calidad y despliegue), cada una con una entrega funcional evaluable, en lugar de un único ciclo en cascada.</w:t>
+      </w:r>
+    </w:p>
+    <w:p>
+      <w:pPr>
+        <w:pStyle w:val="Heading3"/>
+      </w:pPr>
+      <w:r>
+        <w:t>Patrón de arquitectura</w:t>
+      </w:r>
+    </w:p>
+    <w:p>
+      <w:r>
+        <w:rPr>
+          <w:i w:val="0"/>
+        </w:rPr>
+        <w:t>MVVM (Model-View-ViewModel) en la app Android y arquitectura en capas (routers → services → schemas → models) en el backend. Ambos patrones son proporcionales al tamaño del equipo (un desarrollador), al problema (una API REST bien delimitada) y a los plazos acotados por evaluación: separan responsabilidades sin la sobrecarga de un diseño más complejo (p. ej. microservicios), que no se justifica para el alcance de este proyecto.</w:t>
+      </w:r>
+    </w:p>
+    <w:p>
+      <w:pPr>
+        <w:pStyle w:val="Heading2"/>
+      </w:pPr>
+      <w:r>
+        <w:t>7. Planificación del proyecto (Carta Gantt)</w:t>
       </w:r>
     </w:p>
     <w:p>
@@ -1165,7 +1245,7 @@
       <w:r>
         <w:drawing>
           <wp:inline xmlns:a="http://schemas.openxmlformats.org/drawingml/2006/main" xmlns:pic="http://schemas.openxmlformats.org/drawingml/2006/picture">
-            <wp:extent cx="5669280" cy="2938094"/>
+            <wp:extent cx="5669280" cy="2976642"/>
             <wp:docPr id="2" name="Picture 2"/>
             <wp:cNvGraphicFramePr>
               <a:graphicFrameLocks noChangeAspect="1"/>
@@ -1186,7 +1266,7 @@
                   <pic:spPr>
                     <a:xfrm>
                       <a:off x="0" y="0"/>
-                      <a:ext cx="5669280" cy="2938094"/>
+                      <a:ext cx="5669280" cy="2976642"/>
                     </a:xfrm>
                     <a:prstGeom prst="rect"/>
                   </pic:spPr>
@@ -1215,7 +1295,7 @@
         <w:pStyle w:val="Heading2"/>
       </w:pPr>
       <w:r>
-        <w:t>7. Arquitectura tecnológica y justificación de servicios cloud</w:t>
+        <w:t>8. Arquitectura tecnológica y justificación de servicios cloud</w:t>
       </w:r>
     </w:p>
     <w:p>
@@ -1482,7 +1562,7 @@
         <w:pStyle w:val="Heading2"/>
       </w:pPr>
       <w:r>
-        <w:t>8. Conceptualización y atributos de calidad</w:t>
+        <w:t>9. Conceptualización y atributos de calidad</w:t>
       </w:r>
     </w:p>
     <w:p>
@@ -1530,7 +1610,7 @@
         <w:pStyle w:val="Heading2"/>
       </w:pPr>
       <w:r>
-        <w:t>9. Estrategia de certificación y revisiones parciales</w:t>
+        <w:t>10. Estrategia de certificación y revisiones parciales</w:t>
       </w:r>
     </w:p>
     <w:p>
@@ -1898,7 +1978,7 @@
         <w:pStyle w:val="Heading2"/>
       </w:pPr>
       <w:r>
-        <w:t>10. Diseño de la solución: Modelo 4+1 de Kruchten</w:t>
+        <w:t>11. Diseño de la solución: Modelo 4+1 de Kruchten</w:t>
       </w:r>
     </w:p>
     <w:p>
@@ -1906,7 +1986,7 @@
         <w:pStyle w:val="Heading3"/>
       </w:pPr>
       <w:r>
-        <w:t>10.1 Vista de Escenarios (Casos de Uso — el «+1»)</w:t>
+        <w:t>11.1 Vista de Escenarios (Casos de Uso — el «+1»)</w:t>
       </w:r>
     </w:p>
     <w:p>
@@ -1974,7 +2054,7 @@
         <w:pStyle w:val="Heading3"/>
       </w:pPr>
       <w:r>
-        <w:t>10.2 Vista Lógica (diseño del software)</w:t>
+        <w:t>11.2 Vista Lógica (diseño del software)</w:t>
       </w:r>
     </w:p>
     <w:p>
@@ -2042,7 +2122,7 @@
         <w:pStyle w:val="Heading3"/>
       </w:pPr>
       <w:r>
-        <w:t>10.3 Vista de Procesos (flujo y concurrencia)</w:t>
+        <w:t>11.3 Vista de Procesos (flujo y concurrencia)</w:t>
       </w:r>
     </w:p>
     <w:p>
@@ -2058,7 +2138,7 @@
         <w:pStyle w:val="Heading3"/>
       </w:pPr>
       <w:r>
-        <w:t>10.4 Vista de Desarrollo (estructura del código)</w:t>
+        <w:t>11.4 Vista de Desarrollo (estructura del código)</w:t>
       </w:r>
     </w:p>
     <w:p>
@@ -2074,7 +2154,7 @@
         <w:pStyle w:val="Heading3"/>
       </w:pPr>
       <w:r>
-        <w:t>10.5 Vista de Despliegue (infraestructura)</w:t>
+        <w:t>11.5 Vista de Despliegue (infraestructura)</w:t>
       </w:r>
     </w:p>
     <w:p>
@@ -2142,7 +2222,7 @@
         <w:pStyle w:val="Heading2"/>
       </w:pPr>
       <w:r>
-        <w:t>11. Configuración de servidores (paridad Dev/Prod)</w:t>
+        <w:t>12. Configuración de servidores (paridad Dev/Prod)</w:t>
       </w:r>
     </w:p>
     <w:p>
@@ -2158,7 +2238,7 @@
         <w:pStyle w:val="Heading3"/>
       </w:pPr>
       <w:r>
-        <w:t>11.1 Receta del servidor — Dockerfile</w:t>
+        <w:t>12.1 Receta del servidor — Dockerfile</w:t>
       </w:r>
     </w:p>
     <w:p>
@@ -2174,7 +2254,7 @@
         <w:pStyle w:val="Heading3"/>
       </w:pPr>
       <w:r>
-        <w:t>11.2 Variables de entorno</w:t>
+        <w:t>12.2 Variables de entorno</w:t>
       </w:r>
     </w:p>
     <w:tbl>
@@ -2433,7 +2513,7 @@
         <w:pStyle w:val="Heading3"/>
       </w:pPr>
       <w:r>
-        <w:t>11.3 Despliegue verificado (EC2 + RDS)</w:t>
+        <w:t>12.3 Despliegue verificado (EC2 + RDS)</w:t>
       </w:r>
     </w:p>
     <w:p>
@@ -2449,7 +2529,7 @@
         <w:pStyle w:val="Heading2"/>
       </w:pPr>
       <w:r>
-        <w:t>12. Procedimiento de copia de seguridad y restauración (RDS PostgreSQL)</w:t>
+        <w:t>13. Procedimiento de copia de seguridad y restauración (RDS PostgreSQL)</w:t>
       </w:r>
     </w:p>
     <w:p>
@@ -2510,7 +2590,7 @@
         <w:pStyle w:val="Heading2"/>
       </w:pPr>
       <w:r>
-        <w:t>13. Plan de pruebas</w:t>
+        <w:t>14. Plan de pruebas</w:t>
       </w:r>
     </w:p>
     <w:p>
@@ -2857,7 +2937,7 @@
         <w:pStyle w:val="Heading3"/>
       </w:pPr>
       <w:r>
-        <w:t>13.1 Verificación del estado de madurez de la fruta (prioridad)</w:t>
+        <w:t>14.1 Verificación del estado de madurez de la fruta (prioridad)</w:t>
       </w:r>
     </w:p>
     <w:p>
@@ -3190,7 +3270,7 @@
         <w:pStyle w:val="Heading2"/>
       </w:pPr>
       <w:r>
-        <w:t>14. Base de datos de pruebas</w:t>
+        <w:t>15. Base de datos de pruebas</w:t>
       </w:r>
     </w:p>
     <w:p>
@@ -3206,7 +3286,7 @@
         <w:pStyle w:val="Heading2"/>
       </w:pPr>
       <w:r>
-        <w:t>15. Aplicación de pruebas y resultados</w:t>
+        <w:t>16. Aplicación de pruebas y resultados</w:t>
       </w:r>
     </w:p>
     <w:p>
@@ -3538,7 +3618,7 @@
         <w:pStyle w:val="Heading3"/>
       </w:pPr>
       <w:r>
-        <w:t>15.1 Cobertura de código</w:t>
+        <w:t>16.1 Cobertura de código</w:t>
       </w:r>
     </w:p>
     <w:p>
@@ -3554,7 +3634,7 @@
         <w:pStyle w:val="Heading2"/>
       </w:pPr>
       <w:r>
-        <w:t>16. Pruebas de rendimiento y concurrencia</w:t>
+        <w:t>17. Pruebas de rendimiento y concurrencia</w:t>
       </w:r>
     </w:p>
     <w:p>
@@ -3739,7 +3819,7 @@
         <w:pStyle w:val="Heading2"/>
       </w:pPr>
       <w:r>
-        <w:t>17. Mejoras al producto</w:t>
+        <w:t>18. Mejoras al producto</w:t>
       </w:r>
     </w:p>
     <w:p>
@@ -3954,7 +4034,7 @@
         <w:pStyle w:val="Heading2"/>
       </w:pPr>
       <w:r>
-        <w:t>18. Evidencia de control de versiones</w:t>
+        <w:t>19. Evidencia de control de versiones</w:t>
       </w:r>
     </w:p>
     <w:p>
@@ -3983,7 +4063,7 @@
         <w:pStyle w:val="Heading2"/>
       </w:pPr>
       <w:r>
-        <w:t>19. Conclusión</w:t>
+        <w:t>20. Conclusión</w:t>
       </w:r>
     </w:p>
     <w:p>
@@ -3999,7 +4079,7 @@
         <w:pStyle w:val="Heading2"/>
       </w:pPr>
       <w:r>
-        <w:t>20. Aprendizajes</w:t>
+        <w:t>21. Aprendizajes</w:t>
       </w:r>
     </w:p>
     <w:p>
@@ -4063,7 +4143,7 @@
         <w:pStyle w:val="Heading2"/>
       </w:pPr>
       <w:r>
-        <w:t>21. Anexos</w:t>
+        <w:t>22. Anexos</w:t>
       </w:r>
     </w:p>
     <w:p>
@@ -4462,7 +4542,15 @@
         <w:rPr>
           <w:i w:val="0"/>
         </w:rPr>
-        <w:t>users(user_id PK, username UNIQUE, email UNIQUE, hashed_password, is_active, created_at) · scans(id PK, user_id FK, fruit_type, maturity_label, confidence, bbox, recommendation, color_code, created_at) · scan_feedback(id PK, scan_id FK, user_id, rating 1-5, created_at). Gestionado con Alembic.</w:t>
+        <w:t>users(user_id PK, username UNIQUE, email UNIQUE, hashed_password, is_active, created_at) · scans(scan_id PK, user_token, fruit_type, maturity_label, confidence, bbox, recommendation, color_code, created_at) · scan_feedback(feedback_id PK, scan_id FK→scans.scan_id ON DELETE CASCADE, user_id FK→users.user_id ON DELETE CASCADE, rating 1-5, created_at). Gestionado con Alembic.</w:t>
+      </w:r>
+    </w:p>
+    <w:p>
+      <w:r>
+        <w:rPr>
+          <w:i/>
+        </w:rPr>
+        <w:t>Nota de integridad referencial: scans.user_token almacena el user_id del usuario autenticado (nombre heredado de una versión previa sin autenticación real); no está declarado como FOREIGN KEY a nivel de motor, a diferencia de scan_feedback. La integridad se garantiza hoy a nivel de aplicación (el valor se puebla desde el JWT verificado, nunca desde input del cliente). Mejora identificada y pendiente: agregar el FK explícito y renombrar la columna a user_id.</w:t>
       </w:r>
     </w:p>
     <w:p>

</xml_diff>